<commit_message>
fix: keep Frontend and Backend labels in English in Turkish CV
</commit_message>
<xml_diff>
--- a/public/cv/turkish/CV.docx
+++ b/public/cv/turkish/CV.docx
@@ -659,7 +659,7 @@
               <w:pStyle w:val="767"/>
             </w:pPr>
             <w:r>
-              <w:t>Ön yüz: React, Next.js</w:t>
+              <w:t>Frontend: React, Next.js</w:t>
             </w:r>
           </w:p>
           <w:p>
@@ -675,7 +675,7 @@
               <w:pStyle w:val="767"/>
             </w:pPr>
             <w:r>
-              <w:t>Arka yüz: NestJS, .NET, .NET Web API, REST API</w:t>
+              <w:t>Backend: NestJS, .NET, .NET Web API, REST API</w:t>
             </w:r>
           </w:p>
           <w:p>

</xml_diff>